<commit_message>
feat: add branding assets and distribution folder validation
- Added a new SVG logo for the project in public/brand/logo-mark.svg.
- Implemented a function to parse and validate distribution folder configurations in scripts/distribution-folders.mjs.
- Created tests for the distribution folder parsing logic to ensure proper handling of valid and invalid inputs in scripts/distribution-folders.test.mjs.
- Added ownership and copyright tests to verify project metadata consistency in scripts/ownership.test.mjs.
- Defined application owner and copyright constants in src/app/branding.ts.
</commit_message>
<xml_diff>
--- a/İHBAR FÖY KASKO.docx
+++ b/İHBAR FÖY KASKO.docx
@@ -50,51 +50,12 @@
             </w:pPr>
             <w:r>
               <w:rPr>
-                <w:b/>
-                <w:i/>
-                <w:color w:val="D1D1C7"/>
-                <w:sz w:val="34"/>
-              </w:rPr>
-              <w:t>BARAN</w:t>
-            </w:r>
-            <w:r>
-              <w:rPr>
-                <w:b/>
-                <w:i/>
-                <w:color w:val="D1D1C7"/>
-                <w:spacing w:val="-5"/>
-                <w:sz w:val="34"/>
-              </w:rPr>
-              <w:t xml:space="preserve"> </w:t>
-            </w:r>
-            <w:r>
-              <w:rPr>
-                <w:b/>
-                <w:i/>
-                <w:color w:val="D1D1C7"/>
-                <w:sz w:val="34"/>
-              </w:rPr>
-              <w:t>GLOBAL</w:t>
-            </w:r>
-            <w:r>
-              <w:rPr>
-                <w:b/>
-                <w:i/>
-                <w:color w:val="D1D1C7"/>
-                <w:spacing w:val="-5"/>
-                <w:sz w:val="34"/>
-              </w:rPr>
-              <w:t xml:space="preserve"> </w:t>
-            </w:r>
-            <w:r>
-              <w:rPr>
-                <w:b/>
-                <w:i/>
-                <w:color w:val="D1D1C7"/>
-                <w:spacing w:val="-2"/>
-                <w:sz w:val="34"/>
-              </w:rPr>
-              <w:t>EKSPERTİZ</w:t>
+                <w:rFonts w:ascii="Arial" w:hAnsi="Arial" w:cs="Arial"/>
+                <w:b/>
+                <w:color w:val="000000"/>
+                <w:sz w:val="24"/>
+              </w:rPr>
+              <w:t>Ömer Faruk İŞLEYEN</w:t>
             </w:r>
           </w:p>
         </w:tc>

</xml_diff>